<commit_message>
docs: update PM SOP with browser test corrections
</commit_message>
<xml_diff>
--- a/ACC_PM_SOP.docx
+++ b/ACC_PM_SOP.docx
@@ -360,7 +360,7 @@
           <w:sz w:val="20"/>
           <w:szCs w:val="20"/>
         </w:rPr>
-        <w:t xml:space="preserve">Enter your email and password.</w:t>
+        <w:t xml:space="preserve">Enter your username (or email) and password.</w:t>
       </w:r>
     </w:p>
     <w:p>
@@ -994,7 +994,7 @@
           <w:sz w:val="20"/>
           <w:szCs w:val="20"/>
         </w:rPr>
-        <w:t xml:space="preserve">Site Address and City.</w:t>
+        <w:t xml:space="preserve">Site Address — required. City — optional (fills in separately).</w:t>
       </w:r>
     </w:p>
     <w:p>
@@ -1013,7 +1013,7 @@
           <w:sz w:val="20"/>
           <w:szCs w:val="20"/>
         </w:rPr>
-        <w:t xml:space="preserve">PM — your name or the assigned PM.</w:t>
+        <w:t xml:space="preserve">PM — select from the dropdown (Steve Frederickson, Ben Davidson, Kenneth Stafford, Luis Galvan, Nicole Diedrich, Jenny Supp).</w:t>
       </w:r>
     </w:p>
     <w:p>
@@ -1089,7 +1089,7 @@
           <w:sz w:val="20"/>
           <w:szCs w:val="20"/>
         </w:rPr>
-        <w:t xml:space="preserve">Notes — anything relevant at intake.</w:t>
+        <w:t xml:space="preserve">Build Notes — five audience-scoped fields: Intake/Source Notes (internal context), Install Instructions (field crew), Finishing Dept, Shop Build Notes, and Client-Facing Notes. Fill what’s known at intake; all are optional.</w:t>
       </w:r>
     </w:p>
     <w:p>
@@ -1155,7 +1155,7 @@
           <w:sz w:val="18"/>
           <w:szCs w:val="18"/>
         </w:rPr>
-        <w:t xml:space="preserve">You can leave most fields blank and fill them in later via Edit — the only required field is Client Name.</w:t>
+        <w:t xml:space="preserve">Required fields are Client Name and Site Address. Everything else can be filled in later via Edit.</w:t>
       </w:r>
     </w:p>
     <w:p>

</xml_diff>